<commit_message>
build done lock and unlock user have add reason
</commit_message>
<xml_diff>
--- a/Report  Week/report week  2.docx
+++ b/Report  Week/report week  2.docx
@@ -6,13 +6,34 @@
       <w:pPr>
         <w:jc w:val="center"/>
         <w:rPr>
+          <w:rFonts w:hint="default" w:ascii="Times New Roman" w:hAnsi="Times New Roman" w:cs="Times New Roman"/>
+          <w:b/>
+          <w:bCs/>
+          <w:sz w:val="32"/>
+          <w:szCs w:val="32"/>
+          <w:lang w:val="vi-VN"/>
+        </w:rPr>
+      </w:pPr>
+      <w:r>
+        <w:rPr>
           <w:rFonts w:ascii="Times New Roman" w:hAnsi="Times New Roman" w:cs="Times New Roman"/>
           <w:b/>
           <w:bCs/>
           <w:sz w:val="32"/>
           <w:szCs w:val="32"/>
         </w:rPr>
-      </w:pPr>
+        <w:t xml:space="preserve">BÁO CÁO TIẾN ĐỘ DỰ ÁN </w:t>
+      </w:r>
+      <w:r>
+        <w:rPr>
+          <w:rFonts w:hint="default" w:ascii="Times New Roman" w:hAnsi="Times New Roman" w:cs="Times New Roman"/>
+          <w:b/>
+          <w:bCs/>
+          <w:sz w:val="32"/>
+          <w:szCs w:val="32"/>
+        </w:rPr>
+        <w:t>XÂY DỰNG HỆ THỐNG QUẢN LÝ VÀ GIẢM LÃNG PHÍ THỰC PHẨM TRONG KHÁCH SẠN - NHÀ HÀNG BẰNG AI DỰ ĐOÁN NHU CẦU</w:t>
+      </w:r>
       <w:r>
         <w:rPr>
           <w:rFonts w:ascii="Times New Roman" w:hAnsi="Times New Roman" w:cs="Times New Roman"/>
@@ -21,7 +42,7 @@
           <w:sz w:val="32"/>
           <w:szCs w:val="32"/>
         </w:rPr>
-        <w:t xml:space="preserve">BÁO CÁO TIẾN ĐỘ DỰ ÁN </w:t>
+        <w:t xml:space="preserve"> - LẦN </w:t>
       </w:r>
       <w:r>
         <w:rPr>
@@ -30,18 +51,9 @@
           <w:bCs/>
           <w:sz w:val="32"/>
           <w:szCs w:val="32"/>
-        </w:rPr>
-        <w:t>XÂY DỰNG HỆ THỐNG QUẢN LÝ VÀ GIẢM LÃNG PHÍ THỰC PHẨM TRONG KHÁCH SẠN - NHÀ HÀNG BẰNG AI DỰ ĐOÁN NHU CẦU</w:t>
-      </w:r>
-      <w:r>
-        <w:rPr>
-          <w:rFonts w:ascii="Times New Roman" w:hAnsi="Times New Roman" w:cs="Times New Roman"/>
-          <w:b/>
-          <w:bCs/>
-          <w:sz w:val="32"/>
-          <w:szCs w:val="32"/>
-        </w:rPr>
-        <w:t xml:space="preserve"> - LẦN 1</w:t>
+          <w:lang w:val="vi-VN"/>
+        </w:rPr>
+        <w:t>2</w:t>
       </w:r>
     </w:p>
     <w:p>
@@ -106,6 +118,8 @@
         </w:rPr>
         <w:t>70</w:t>
       </w:r>
+      <w:bookmarkStart w:id="0" w:name="_GoBack"/>
+      <w:bookmarkEnd w:id="0"/>
     </w:p>
     <w:p>
       <w:pPr>
@@ -1202,7 +1216,6 @@
           <w:szCs w:val="26"/>
         </w:rPr>
       </w:pPr>
-      <w:bookmarkStart w:id="0" w:name="_GoBack"/>
       <w:r>
         <w:rPr>
           <w:rFonts w:hint="default" w:ascii="Times New Roman" w:hAnsi="Times New Roman" w:cs="Times New Roman"/>
@@ -1212,7 +1225,6 @@
         <w:t xml:space="preserve">Xây dựng và kết nối giao diện frontend với backend thông qua API. </w:t>
       </w:r>
     </w:p>
-    <w:bookmarkEnd w:id="0"/>
     <w:p>
       <w:pPr>
         <w:numPr>
@@ -1483,7 +1495,7 @@
     <w:lsdException w:qFormat="1" w:unhideWhenUsed="0" w:uiPriority="0" w:semiHidden="0" w:name="Title"/>
     <w:lsdException w:unhideWhenUsed="0" w:uiPriority="0" w:semiHidden="0" w:name="Closing"/>
     <w:lsdException w:unhideWhenUsed="0" w:uiPriority="0" w:semiHidden="0" w:name="Signature"/>
-    <w:lsdException w:unhideWhenUsed="0" w:uiPriority="0" w:name="Default Paragraph Font"/>
+    <w:lsdException w:qFormat="1" w:unhideWhenUsed="0" w:uiPriority="0" w:name="Default Paragraph Font"/>
     <w:lsdException w:unhideWhenUsed="0" w:uiPriority="0" w:semiHidden="0" w:name="Body Text"/>
     <w:lsdException w:unhideWhenUsed="0" w:uiPriority="0" w:semiHidden="0" w:name="Body Text Indent"/>
     <w:lsdException w:unhideWhenUsed="0" w:uiPriority="0" w:semiHidden="0" w:name="List Continue"/>
@@ -1510,7 +1522,7 @@
     <w:lsdException w:unhideWhenUsed="0" w:uiPriority="0" w:semiHidden="0" w:name="Document Map"/>
     <w:lsdException w:unhideWhenUsed="0" w:uiPriority="0" w:semiHidden="0" w:name="Plain Text"/>
     <w:lsdException w:unhideWhenUsed="0" w:uiPriority="0" w:semiHidden="0" w:name="E-mail Signature"/>
-    <w:lsdException w:unhideWhenUsed="0" w:uiPriority="0" w:semiHidden="0" w:name="Normal (Web)"/>
+    <w:lsdException w:qFormat="1" w:unhideWhenUsed="0" w:uiPriority="0" w:semiHidden="0" w:name="Normal (Web)"/>
     <w:lsdException w:unhideWhenUsed="0" w:uiPriority="0" w:semiHidden="0" w:name="HTML Acronym"/>
     <w:lsdException w:unhideWhenUsed="0" w:uiPriority="0" w:semiHidden="0" w:name="HTML Address"/>
     <w:lsdException w:unhideWhenUsed="0" w:uiPriority="0" w:semiHidden="0" w:name="HTML Cite"/>
@@ -1707,6 +1719,7 @@
   <w:style w:type="character" w:default="1" w:styleId="3">
     <w:name w:val="Default Paragraph Font"/>
     <w:semiHidden/>
+    <w:qFormat/>
     <w:uiPriority w:val="0"/>
   </w:style>
   <w:style w:type="table" w:default="1" w:styleId="4">
@@ -1725,6 +1738,7 @@
   </w:style>
   <w:style w:type="paragraph" w:styleId="5">
     <w:name w:val="Normal (Web)"/>
+    <w:qFormat/>
     <w:uiPriority w:val="0"/>
     <w:pPr>
       <w:spacing w:before="0" w:beforeAutospacing="1" w:after="0" w:afterAutospacing="1"/>
@@ -1732,6 +1746,7 @@
       <w:jc w:val="left"/>
     </w:pPr>
     <w:rPr>
+      <w:rFonts w:ascii="Times New Roman" w:hAnsi="Times New Roman" w:eastAsia="SimSun" w:cs="Times New Roman"/>
       <w:kern w:val="0"/>
       <w:sz w:val="24"/>
       <w:szCs w:val="24"/>

</xml_diff>

<commit_message>
build done lock and unlock user have add reason (#50)
</commit_message>
<xml_diff>
--- a/Report  Week/report week  2.docx
+++ b/Report  Week/report week  2.docx
@@ -6,13 +6,34 @@
       <w:pPr>
         <w:jc w:val="center"/>
         <w:rPr>
+          <w:rFonts w:hint="default" w:ascii="Times New Roman" w:hAnsi="Times New Roman" w:cs="Times New Roman"/>
+          <w:b/>
+          <w:bCs/>
+          <w:sz w:val="32"/>
+          <w:szCs w:val="32"/>
+          <w:lang w:val="vi-VN"/>
+        </w:rPr>
+      </w:pPr>
+      <w:r>
+        <w:rPr>
           <w:rFonts w:ascii="Times New Roman" w:hAnsi="Times New Roman" w:cs="Times New Roman"/>
           <w:b/>
           <w:bCs/>
           <w:sz w:val="32"/>
           <w:szCs w:val="32"/>
         </w:rPr>
-      </w:pPr>
+        <w:t xml:space="preserve">BÁO CÁO TIẾN ĐỘ DỰ ÁN </w:t>
+      </w:r>
+      <w:r>
+        <w:rPr>
+          <w:rFonts w:hint="default" w:ascii="Times New Roman" w:hAnsi="Times New Roman" w:cs="Times New Roman"/>
+          <w:b/>
+          <w:bCs/>
+          <w:sz w:val="32"/>
+          <w:szCs w:val="32"/>
+        </w:rPr>
+        <w:t>XÂY DỰNG HỆ THỐNG QUẢN LÝ VÀ GIẢM LÃNG PHÍ THỰC PHẨM TRONG KHÁCH SẠN - NHÀ HÀNG BẰNG AI DỰ ĐOÁN NHU CẦU</w:t>
+      </w:r>
       <w:r>
         <w:rPr>
           <w:rFonts w:ascii="Times New Roman" w:hAnsi="Times New Roman" w:cs="Times New Roman"/>
@@ -21,7 +42,7 @@
           <w:sz w:val="32"/>
           <w:szCs w:val="32"/>
         </w:rPr>
-        <w:t xml:space="preserve">BÁO CÁO TIẾN ĐỘ DỰ ÁN </w:t>
+        <w:t xml:space="preserve"> - LẦN </w:t>
       </w:r>
       <w:r>
         <w:rPr>
@@ -30,18 +51,9 @@
           <w:bCs/>
           <w:sz w:val="32"/>
           <w:szCs w:val="32"/>
-        </w:rPr>
-        <w:t>XÂY DỰNG HỆ THỐNG QUẢN LÝ VÀ GIẢM LÃNG PHÍ THỰC PHẨM TRONG KHÁCH SẠN - NHÀ HÀNG BẰNG AI DỰ ĐOÁN NHU CẦU</w:t>
-      </w:r>
-      <w:r>
-        <w:rPr>
-          <w:rFonts w:ascii="Times New Roman" w:hAnsi="Times New Roman" w:cs="Times New Roman"/>
-          <w:b/>
-          <w:bCs/>
-          <w:sz w:val="32"/>
-          <w:szCs w:val="32"/>
-        </w:rPr>
-        <w:t xml:space="preserve"> - LẦN 1</w:t>
+          <w:lang w:val="vi-VN"/>
+        </w:rPr>
+        <w:t>2</w:t>
       </w:r>
     </w:p>
     <w:p>
@@ -106,6 +118,8 @@
         </w:rPr>
         <w:t>70</w:t>
       </w:r>
+      <w:bookmarkStart w:id="0" w:name="_GoBack"/>
+      <w:bookmarkEnd w:id="0"/>
     </w:p>
     <w:p>
       <w:pPr>
@@ -1202,7 +1216,6 @@
           <w:szCs w:val="26"/>
         </w:rPr>
       </w:pPr>
-      <w:bookmarkStart w:id="0" w:name="_GoBack"/>
       <w:r>
         <w:rPr>
           <w:rFonts w:hint="default" w:ascii="Times New Roman" w:hAnsi="Times New Roman" w:cs="Times New Roman"/>
@@ -1212,7 +1225,6 @@
         <w:t xml:space="preserve">Xây dựng và kết nối giao diện frontend với backend thông qua API. </w:t>
       </w:r>
     </w:p>
-    <w:bookmarkEnd w:id="0"/>
     <w:p>
       <w:pPr>
         <w:numPr>
@@ -1483,7 +1495,7 @@
     <w:lsdException w:qFormat="1" w:unhideWhenUsed="0" w:uiPriority="0" w:semiHidden="0" w:name="Title"/>
     <w:lsdException w:unhideWhenUsed="0" w:uiPriority="0" w:semiHidden="0" w:name="Closing"/>
     <w:lsdException w:unhideWhenUsed="0" w:uiPriority="0" w:semiHidden="0" w:name="Signature"/>
-    <w:lsdException w:unhideWhenUsed="0" w:uiPriority="0" w:name="Default Paragraph Font"/>
+    <w:lsdException w:qFormat="1" w:unhideWhenUsed="0" w:uiPriority="0" w:name="Default Paragraph Font"/>
     <w:lsdException w:unhideWhenUsed="0" w:uiPriority="0" w:semiHidden="0" w:name="Body Text"/>
     <w:lsdException w:unhideWhenUsed="0" w:uiPriority="0" w:semiHidden="0" w:name="Body Text Indent"/>
     <w:lsdException w:unhideWhenUsed="0" w:uiPriority="0" w:semiHidden="0" w:name="List Continue"/>
@@ -1510,7 +1522,7 @@
     <w:lsdException w:unhideWhenUsed="0" w:uiPriority="0" w:semiHidden="0" w:name="Document Map"/>
     <w:lsdException w:unhideWhenUsed="0" w:uiPriority="0" w:semiHidden="0" w:name="Plain Text"/>
     <w:lsdException w:unhideWhenUsed="0" w:uiPriority="0" w:semiHidden="0" w:name="E-mail Signature"/>
-    <w:lsdException w:unhideWhenUsed="0" w:uiPriority="0" w:semiHidden="0" w:name="Normal (Web)"/>
+    <w:lsdException w:qFormat="1" w:unhideWhenUsed="0" w:uiPriority="0" w:semiHidden="0" w:name="Normal (Web)"/>
     <w:lsdException w:unhideWhenUsed="0" w:uiPriority="0" w:semiHidden="0" w:name="HTML Acronym"/>
     <w:lsdException w:unhideWhenUsed="0" w:uiPriority="0" w:semiHidden="0" w:name="HTML Address"/>
     <w:lsdException w:unhideWhenUsed="0" w:uiPriority="0" w:semiHidden="0" w:name="HTML Cite"/>
@@ -1707,6 +1719,7 @@
   <w:style w:type="character" w:default="1" w:styleId="3">
     <w:name w:val="Default Paragraph Font"/>
     <w:semiHidden/>
+    <w:qFormat/>
     <w:uiPriority w:val="0"/>
   </w:style>
   <w:style w:type="table" w:default="1" w:styleId="4">
@@ -1725,6 +1738,7 @@
   </w:style>
   <w:style w:type="paragraph" w:styleId="5">
     <w:name w:val="Normal (Web)"/>
+    <w:qFormat/>
     <w:uiPriority w:val="0"/>
     <w:pPr>
       <w:spacing w:before="0" w:beforeAutospacing="1" w:after="0" w:afterAutospacing="1"/>
@@ -1732,6 +1746,7 @@
       <w:jc w:val="left"/>
     </w:pPr>
     <w:rPr>
+      <w:rFonts w:ascii="Times New Roman" w:hAnsi="Times New Roman" w:eastAsia="SimSun" w:cs="Times New Roman"/>
       <w:kern w:val="0"/>
       <w:sz w:val="24"/>
       <w:szCs w:val="24"/>

</xml_diff>